<commit_message>
Plantillas sin ninguna referencia a la web (sin nota al pie ni metadatos)
Co-Authored-By: Claude Opus 5.5 <noreply@anthropic.com>
</commit_message>
<xml_diff>
--- a/descargas/adaptacion-jornada.docx
+++ b/descargas/adaptacion-jornada.docx
@@ -283,15 +283,6 @@
       </w:r>
     </w:p>
     <w:p/>
-    <w:p>
-      <w:r>
-        <w:rPr>
-          <w:color w:val="6B7280"/>
-          <w:sz w:val="16"/>
-        </w:rPr>
-        <w:t>Modelo orientativo de calculalotuyo.es. Revisa tu convenio colectivo, que puede mejorar lo que dice la ley.</w:t>
-      </w:r>
-    </w:p>
     <w:sectPr>
       <w:pgSz w:w="12240" w:h="15840"/>
       <w:pgMar w:top="1440" w:right="1417" w:bottom="1440" w:left="1417" w:header="720" w:footer="720" w:gutter="0"/>

</xml_diff>